<commit_message>
Dùng PHIM THẬT + POSTER THẬT (Wikipedia, keyless) + slide demo các bước UI
- backend/scripts/generate_real.py: 76 phim nổi tiếng, lấy poster/overview thật từ
  Wikipedia REST API (không cần API key); ratings mô phỏng theo sở thích tiềm ẩn
- poster_url xuyên suốt: schemas, dataset (fillna tránh "nan"), recommender, API
- Frontend: Poster dùng <img> ảnh thật + fallback gradient; Hero dùng poster làm backdrop
- Slide: thêm 5 slide "Demo các bước UI" với ảnh thật; cập nhật số liệu kết quả mới
- README + báo cáo (.md/.docx): cập nhật 76 phim thật, sparsity ~65%, learning curve mới
- Ảnh giao diện cập nhật theo poster thật (đã nén)
</commit_message>
<xml_diff>
--- a/docs/report/report.docx
+++ b/docs/report/report.docx
@@ -326,13 +326,13 @@
         <w:t xml:space="preserve"> </w:t>
       </w:r>
       <w:r>
-        <w:t xml:space="preserve">thái lạnh, trong khi phương pháp lai content + collaborative theo tinh thần</w:t>
-      </w:r>
-      <w:r>
-        <w:t xml:space="preserve"> </w:t>
-      </w:r>
-      <w:r>
-        <w:t xml:space="preserve">DropoutNet vượt trội khi người dùng đã có đủ tương tác — củng cố quan điểm rằng</w:t>
+        <w:t xml:space="preserve">thái lạnh, trong khi các phương pháp dựa collaborative (Onboarding + Item-CF và</w:t>
+      </w:r>
+      <w:r>
+        <w:t xml:space="preserve"> </w:t>
+      </w:r>
+      <w:r>
+        <w:t xml:space="preserve">DropoutNet) vượt trội khi người dùng đã có đủ tương tác — củng cố quan điểm rằng</w:t>
       </w:r>
       <w:r>
         <w:t xml:space="preserve"> </w:t>
@@ -749,19 +749,19 @@
           <w:bCs/>
           <w:b/>
         </w:rPr>
-        <w:t xml:space="preserve">cực kỳ thưa</w:t>
-      </w:r>
-      <w:r>
-        <w:t xml:space="preserve"> </w:t>
-      </w:r>
-      <w:r>
-        <w:t xml:space="preserve">— trong bộ dữ liệu của chúng tôi độ thưa lên</w:t>
-      </w:r>
-      <w:r>
-        <w:t xml:space="preserve"> </w:t>
-      </w:r>
-      <w:r>
-        <w:t xml:space="preserve">tới khoảng 90%. Cold-start là trường hợp đặc biệt nghiêm trọng của tính thưa,</w:t>
+        <w:t xml:space="preserve">rất thưa</w:t>
+      </w:r>
+      <w:r>
+        <w:t xml:space="preserve"> </w:t>
+      </w:r>
+      <w:r>
+        <w:t xml:space="preserve">— trong bộ dữ liệu của chúng tôi độ thưa khoảng</w:t>
+      </w:r>
+      <w:r>
+        <w:t xml:space="preserve"> </w:t>
+      </w:r>
+      <w:r>
+        <w:t xml:space="preserve">65%. Cold-start là trường hợp đặc biệt nghiêm trọng của tính thưa,</w:t>
       </w:r>
       <w:r>
         <w:t xml:space="preserve"> </w:t>
@@ -1559,7 +1559,75 @@
         <w:pStyle w:val="FirstParagraph"/>
       </w:pPr>
       <w:r>
-        <w:t xml:space="preserve">Chúng tôi sử dụng bộ dữ liệu</w:t>
+        <w:t xml:space="preserve">Chúng tôi sử dụng</w:t>
+      </w:r>
+      <w:r>
+        <w:t xml:space="preserve"> </w:t>
+      </w:r>
+      <w:r>
+        <w:rPr>
+          <w:bCs/>
+          <w:b/>
+        </w:rPr>
+        <w:t xml:space="preserve">76 bộ phim thật nổi tiếng</w:t>
+      </w:r>
+      <w:r>
+        <w:t xml:space="preserve"> </w:t>
+      </w:r>
+      <w:r>
+        <w:t xml:space="preserve">(The Matrix, Inception, Parasite,</w:t>
+      </w:r>
+      <w:r>
+        <w:t xml:space="preserve"> </w:t>
+      </w:r>
+      <w:r>
+        <w:t xml:space="preserve">Toy Story…) với</w:t>
+      </w:r>
+      <w:r>
+        <w:t xml:space="preserve"> </w:t>
+      </w:r>
+      <w:r>
+        <w:rPr>
+          <w:bCs/>
+          <w:b/>
+        </w:rPr>
+        <w:t xml:space="preserve">poster, mô tả, năm phát hành lấy thật từ Wikipedia</w:t>
+      </w:r>
+      <w:r>
+        <w:t xml:space="preserve"> </w:t>
+      </w:r>
+      <w:r>
+        <w:t xml:space="preserve">(qua REST</w:t>
+      </w:r>
+      <w:r>
+        <w:t xml:space="preserve"> </w:t>
+      </w:r>
+      <w:r>
+        <w:t xml:space="preserve">API, không cần khoá). Phần tương tác (</w:t>
+      </w:r>
+      <w:r>
+        <w:rPr>
+          <w:bCs/>
+          <w:b/>
+        </w:rPr>
+        <w:t xml:space="preserve">500 người dùng mô phỏng, ~13.389 lượt đánh</w:t>
+      </w:r>
+      <w:r>
+        <w:rPr>
+          <w:bCs/>
+          <w:b/>
+        </w:rPr>
+        <w:t xml:space="preserve"> </w:t>
+      </w:r>
+      <w:r>
+        <w:rPr>
+          <w:bCs/>
+          <w:b/>
+        </w:rPr>
+        <w:t xml:space="preserve">giá</w:t>
+      </w:r>
+      <w:r>
+        <w:t xml:space="preserve">) được</w:t>
       </w:r>
       <w:r>
         <w:t xml:space="preserve"> </w:t>
@@ -1569,13 +1637,13 @@
           <w:iCs/>
           <w:i/>
         </w:rPr>
-        <w:t xml:space="preserve">synthetic có cấu trúc sở thích</w:t>
-      </w:r>
-      <w:r>
-        <w:t xml:space="preserve"> </w:t>
-      </w:r>
-      <w:r>
-        <w:t xml:space="preserve">gồm</w:t>
+        <w:t xml:space="preserve">sinh có cấu trúc sở thích</w:t>
+      </w:r>
+      <w:r>
+        <w:t xml:space="preserve"> </w:t>
+      </w:r>
+      <w:r>
+        <w:t xml:space="preserve">thay vì ngẫu nhiên: ratings sinh từ</w:t>
       </w:r>
       <w:r>
         <w:t xml:space="preserve"> </w:t>
@@ -1585,7 +1653,7 @@
           <w:bCs/>
           <w:b/>
         </w:rPr>
-        <w:t xml:space="preserve">280 phim, 500</w:t>
+        <w:t xml:space="preserve">sở</w:t>
       </w:r>
       <w:r>
         <w:rPr>
@@ -1599,41 +1667,13 @@
           <w:bCs/>
           <w:b/>
         </w:rPr>
-        <w:t xml:space="preserve">người dùng và ~13.520 lượt đánh giá</w:t>
-      </w:r>
-      <w:r>
-        <w:t xml:space="preserve"> </w:t>
-      </w:r>
-      <w:r>
-        <w:t xml:space="preserve">(16 thể loại). Điểm khác biệt quan trọng:</w:t>
-      </w:r>
-      <w:r>
-        <w:t xml:space="preserve"> </w:t>
-      </w:r>
-      <w:r>
-        <w:t xml:space="preserve">ratings không sinh ngẫu nhiên mà từ</w:t>
-      </w:r>
-      <w:r>
-        <w:t xml:space="preserve"> </w:t>
-      </w:r>
-      <w:r>
-        <w:rPr>
-          <w:bCs/>
-          <w:b/>
-        </w:rPr>
-        <w:t xml:space="preserve">sở thích tiềm ẩn theo thể loại</w:t>
-      </w:r>
-      <w:r>
-        <w:t xml:space="preserve"> </w:t>
-      </w:r>
-      <w:r>
-        <w:t xml:space="preserve">của từng</w:t>
-      </w:r>
-      <w:r>
-        <w:t xml:space="preserve"> </w:t>
-      </w:r>
-      <w:r>
-        <w:t xml:space="preserve">người dùng cộng với</w:t>
+        <w:t xml:space="preserve">thích tiềm ẩn theo thể loại</w:t>
+      </w:r>
+      <w:r>
+        <w:t xml:space="preserve"> </w:t>
+      </w:r>
+      <w:r>
+        <w:t xml:space="preserve">của từng người dùng cộng với</w:t>
       </w:r>
       <w:r>
         <w:t xml:space="preserve"> </w:t>
@@ -1651,7 +1691,13 @@
         <w:t xml:space="preserve"> </w:t>
       </w:r>
       <w:r>
-        <w:t xml:space="preserve">nội tại của phim và một lượng nhiễu nhỏ:</w:t>
+        <w:t xml:space="preserve">nội tại</w:t>
+      </w:r>
+      <w:r>
+        <w:t xml:space="preserve"> </w:t>
+      </w:r>
+      <w:r>
+        <w:t xml:space="preserve">của phim và một lượng nhiễu nhỏ:</w:t>
       </w:r>
     </w:p>
     <w:p>
@@ -3105,7 +3151,7 @@
         <w:t xml:space="preserve"> </w:t>
       </w:r>
       <w:r>
-        <w:t xml:space="preserve">thấy gợi ý thay đổi tức thì. Poster được</w:t>
+        <w:t xml:space="preserve">thấy gợi ý thay đổi tức thì. Poster là</w:t>
       </w:r>
       <w:r>
         <w:t xml:space="preserve"> </w:t>
@@ -3115,19 +3161,29 @@
           <w:bCs/>
           <w:b/>
         </w:rPr>
-        <w:t xml:space="preserve">sinh bằng CSS gradient</w:t>
-      </w:r>
-      <w:r>
-        <w:t xml:space="preserve"> </w:t>
-      </w:r>
-      <w:r>
-        <w:t xml:space="preserve">theo tên và</w:t>
-      </w:r>
-      <w:r>
-        <w:t xml:space="preserve"> </w:t>
-      </w:r>
-      <w:r>
-        <w:t xml:space="preserve">thể loại, hoạt động hoàn toàn offline.</w:t>
+        <w:t xml:space="preserve">ảnh phim thật</w:t>
+      </w:r>
+      <w:r>
+        <w:t xml:space="preserve"> </w:t>
+      </w:r>
+      <w:r>
+        <w:t xml:space="preserve">(lấy từ Wikipedia), có</w:t>
+      </w:r>
+      <w:r>
+        <w:t xml:space="preserve"> </w:t>
+      </w:r>
+      <w:r>
+        <w:rPr>
+          <w:bCs/>
+          <w:b/>
+        </w:rPr>
+        <w:t xml:space="preserve">fallback gradient CSS</w:t>
+      </w:r>
+      <w:r>
+        <w:t xml:space="preserve"> </w:t>
+      </w:r>
+      <w:r>
+        <w:t xml:space="preserve">khi ảnh lỗi/ngoại tuyến.</w:t>
       </w:r>
     </w:p>
     <w:p>
@@ -3294,7 +3350,7 @@
         <w:pStyle w:val="FirstParagraph"/>
       </w:pPr>
       <w:r>
-        <w:t xml:space="preserve">Bảng dưới đây là Recall@10 trung bình theo số tương tác ban đầu (50 người dùng</w:t>
+        <w:t xml:space="preserve">Bảng dưới đây là Recall@10 trung bình theo số tương tác ban đầu (60 người dùng</w:t>
       </w:r>
       <w:r>
         <w:t xml:space="preserve"> </w:t>
@@ -3408,62 +3464,62 @@
               <w:jc w:val="left"/>
             </w:pPr>
             <w:r>
-              <w:t xml:space="preserve">0.073</w:t>
-            </w:r>
-          </w:p>
-        </w:tc>
-        <w:tc>
-          <w:p>
-            <w:pPr>
-              <w:pStyle w:val="Compact"/>
-              <w:jc w:val="left"/>
-            </w:pPr>
-            <w:r>
-              <w:t xml:space="preserve">0.073</w:t>
-            </w:r>
-          </w:p>
-        </w:tc>
-        <w:tc>
-          <w:p>
-            <w:pPr>
-              <w:pStyle w:val="Compact"/>
-              <w:jc w:val="left"/>
-            </w:pPr>
-            <w:r>
-              <w:t xml:space="preserve">0.073</w:t>
-            </w:r>
-          </w:p>
-        </w:tc>
-        <w:tc>
-          <w:p>
-            <w:pPr>
-              <w:pStyle w:val="Compact"/>
-              <w:jc w:val="left"/>
-            </w:pPr>
-            <w:r>
-              <w:t xml:space="preserve">0.073</w:t>
-            </w:r>
-          </w:p>
-        </w:tc>
-        <w:tc>
-          <w:p>
-            <w:pPr>
-              <w:pStyle w:val="Compact"/>
-              <w:jc w:val="left"/>
-            </w:pPr>
-            <w:r>
-              <w:t xml:space="preserve">0.073</w:t>
-            </w:r>
-          </w:p>
-        </w:tc>
-        <w:tc>
-          <w:p>
-            <w:pPr>
-              <w:pStyle w:val="Compact"/>
-              <w:jc w:val="left"/>
-            </w:pPr>
-            <w:r>
-              <w:t xml:space="preserve">0.073</w:t>
+              <w:t xml:space="preserve">0.196</w:t>
+            </w:r>
+          </w:p>
+        </w:tc>
+        <w:tc>
+          <w:p>
+            <w:pPr>
+              <w:pStyle w:val="Compact"/>
+              <w:jc w:val="left"/>
+            </w:pPr>
+            <w:r>
+              <w:t xml:space="preserve">0.196</w:t>
+            </w:r>
+          </w:p>
+        </w:tc>
+        <w:tc>
+          <w:p>
+            <w:pPr>
+              <w:pStyle w:val="Compact"/>
+              <w:jc w:val="left"/>
+            </w:pPr>
+            <w:r>
+              <w:t xml:space="preserve">0.196</w:t>
+            </w:r>
+          </w:p>
+        </w:tc>
+        <w:tc>
+          <w:p>
+            <w:pPr>
+              <w:pStyle w:val="Compact"/>
+              <w:jc w:val="left"/>
+            </w:pPr>
+            <w:r>
+              <w:t xml:space="preserve">0.196</w:t>
+            </w:r>
+          </w:p>
+        </w:tc>
+        <w:tc>
+          <w:p>
+            <w:pPr>
+              <w:pStyle w:val="Compact"/>
+              <w:jc w:val="left"/>
+            </w:pPr>
+            <w:r>
+              <w:t xml:space="preserve">0.196</w:t>
+            </w:r>
+          </w:p>
+        </w:tc>
+        <w:tc>
+          <w:p>
+            <w:pPr>
+              <w:pStyle w:val="Compact"/>
+              <w:jc w:val="left"/>
+            </w:pPr>
+            <w:r>
+              <w:t xml:space="preserve">0.196</w:t>
             </w:r>
           </w:p>
         </w:tc>
@@ -3487,62 +3543,62 @@
               <w:jc w:val="left"/>
             </w:pPr>
             <w:r>
-              <w:t xml:space="preserve">0.034</w:t>
-            </w:r>
-          </w:p>
-        </w:tc>
-        <w:tc>
-          <w:p>
-            <w:pPr>
-              <w:pStyle w:val="Compact"/>
-              <w:jc w:val="left"/>
-            </w:pPr>
-            <w:r>
-              <w:t xml:space="preserve">0.019</w:t>
-            </w:r>
-          </w:p>
-        </w:tc>
-        <w:tc>
-          <w:p>
-            <w:pPr>
-              <w:pStyle w:val="Compact"/>
-              <w:jc w:val="left"/>
-            </w:pPr>
-            <w:r>
-              <w:t xml:space="preserve">0.036</w:t>
-            </w:r>
-          </w:p>
-        </w:tc>
-        <w:tc>
-          <w:p>
-            <w:pPr>
-              <w:pStyle w:val="Compact"/>
-              <w:jc w:val="left"/>
-            </w:pPr>
-            <w:r>
-              <w:t xml:space="preserve">0.034</w:t>
-            </w:r>
-          </w:p>
-        </w:tc>
-        <w:tc>
-          <w:p>
-            <w:pPr>
-              <w:pStyle w:val="Compact"/>
-              <w:jc w:val="left"/>
-            </w:pPr>
-            <w:r>
-              <w:t xml:space="preserve">0.025</w:t>
-            </w:r>
-          </w:p>
-        </w:tc>
-        <w:tc>
-          <w:p>
-            <w:pPr>
-              <w:pStyle w:val="Compact"/>
-              <w:jc w:val="left"/>
-            </w:pPr>
-            <w:r>
-              <w:t xml:space="preserve">0.050</w:t>
+              <w:t xml:space="preserve">0.134</w:t>
+            </w:r>
+          </w:p>
+        </w:tc>
+        <w:tc>
+          <w:p>
+            <w:pPr>
+              <w:pStyle w:val="Compact"/>
+              <w:jc w:val="left"/>
+            </w:pPr>
+            <w:r>
+              <w:t xml:space="preserve">0.127</w:t>
+            </w:r>
+          </w:p>
+        </w:tc>
+        <w:tc>
+          <w:p>
+            <w:pPr>
+              <w:pStyle w:val="Compact"/>
+              <w:jc w:val="left"/>
+            </w:pPr>
+            <w:r>
+              <w:t xml:space="preserve">0.115</w:t>
+            </w:r>
+          </w:p>
+        </w:tc>
+        <w:tc>
+          <w:p>
+            <w:pPr>
+              <w:pStyle w:val="Compact"/>
+              <w:jc w:val="left"/>
+            </w:pPr>
+            <w:r>
+              <w:t xml:space="preserve">0.123</w:t>
+            </w:r>
+          </w:p>
+        </w:tc>
+        <w:tc>
+          <w:p>
+            <w:pPr>
+              <w:pStyle w:val="Compact"/>
+              <w:jc w:val="left"/>
+            </w:pPr>
+            <w:r>
+              <w:t xml:space="preserve">0.100</w:t>
+            </w:r>
+          </w:p>
+        </w:tc>
+        <w:tc>
+          <w:p>
+            <w:pPr>
+              <w:pStyle w:val="Compact"/>
+              <w:jc w:val="left"/>
+            </w:pPr>
+            <w:r>
+              <w:t xml:space="preserve">0.101</w:t>
             </w:r>
           </w:p>
         </w:tc>
@@ -3566,51 +3622,51 @@
               <w:jc w:val="left"/>
             </w:pPr>
             <w:r>
-              <w:t xml:space="preserve">0.073</w:t>
-            </w:r>
-          </w:p>
-        </w:tc>
-        <w:tc>
-          <w:p>
-            <w:pPr>
-              <w:pStyle w:val="Compact"/>
-              <w:jc w:val="left"/>
-            </w:pPr>
-            <w:r>
-              <w:t xml:space="preserve">0.062</w:t>
-            </w:r>
-          </w:p>
-        </w:tc>
-        <w:tc>
-          <w:p>
-            <w:pPr>
-              <w:pStyle w:val="Compact"/>
-              <w:jc w:val="left"/>
-            </w:pPr>
-            <w:r>
-              <w:t xml:space="preserve">0.070</w:t>
-            </w:r>
-          </w:p>
-        </w:tc>
-        <w:tc>
-          <w:p>
-            <w:pPr>
-              <w:pStyle w:val="Compact"/>
-              <w:jc w:val="left"/>
-            </w:pPr>
-            <w:r>
-              <w:t xml:space="preserve">0.078</w:t>
-            </w:r>
-          </w:p>
-        </w:tc>
-        <w:tc>
-          <w:p>
-            <w:pPr>
-              <w:pStyle w:val="Compact"/>
-              <w:jc w:val="left"/>
-            </w:pPr>
-            <w:r>
-              <w:t xml:space="preserve">0.097</w:t>
+              <w:t xml:space="preserve">0.196</w:t>
+            </w:r>
+          </w:p>
+        </w:tc>
+        <w:tc>
+          <w:p>
+            <w:pPr>
+              <w:pStyle w:val="Compact"/>
+              <w:jc w:val="left"/>
+            </w:pPr>
+            <w:r>
+              <w:t xml:space="preserve">0.192</w:t>
+            </w:r>
+          </w:p>
+        </w:tc>
+        <w:tc>
+          <w:p>
+            <w:pPr>
+              <w:pStyle w:val="Compact"/>
+              <w:jc w:val="left"/>
+            </w:pPr>
+            <w:r>
+              <w:t xml:space="preserve">0.190</w:t>
+            </w:r>
+          </w:p>
+        </w:tc>
+        <w:tc>
+          <w:p>
+            <w:pPr>
+              <w:pStyle w:val="Compact"/>
+              <w:jc w:val="left"/>
+            </w:pPr>
+            <w:r>
+              <w:t xml:space="preserve">0.209</w:t>
+            </w:r>
+          </w:p>
+        </w:tc>
+        <w:tc>
+          <w:p>
+            <w:pPr>
+              <w:pStyle w:val="Compact"/>
+              <w:jc w:val="left"/>
+            </w:pPr>
+            <w:r>
+              <w:t xml:space="preserve">0.225</w:t>
             </w:r>
           </w:p>
         </w:tc>
@@ -3625,7 +3681,7 @@
                 <w:bCs/>
                 <w:b/>
               </w:rPr>
-              <w:t xml:space="preserve">0.104</w:t>
+              <w:t xml:space="preserve">0.267</w:t>
             </w:r>
           </w:p>
         </w:tc>
@@ -3649,51 +3705,51 @@
               <w:jc w:val="left"/>
             </w:pPr>
             <w:r>
-              <w:t xml:space="preserve">0.034</w:t>
-            </w:r>
-          </w:p>
-        </w:tc>
-        <w:tc>
-          <w:p>
-            <w:pPr>
-              <w:pStyle w:val="Compact"/>
-              <w:jc w:val="left"/>
-            </w:pPr>
-            <w:r>
-              <w:t xml:space="preserve">0.027</w:t>
-            </w:r>
-          </w:p>
-        </w:tc>
-        <w:tc>
-          <w:p>
-            <w:pPr>
-              <w:pStyle w:val="Compact"/>
-              <w:jc w:val="left"/>
-            </w:pPr>
-            <w:r>
-              <w:t xml:space="preserve">0.039</w:t>
-            </w:r>
-          </w:p>
-        </w:tc>
-        <w:tc>
-          <w:p>
-            <w:pPr>
-              <w:pStyle w:val="Compact"/>
-              <w:jc w:val="left"/>
-            </w:pPr>
-            <w:r>
-              <w:t xml:space="preserve">0.067</w:t>
-            </w:r>
-          </w:p>
-        </w:tc>
-        <w:tc>
-          <w:p>
-            <w:pPr>
-              <w:pStyle w:val="Compact"/>
-              <w:jc w:val="left"/>
-            </w:pPr>
-            <w:r>
-              <w:t xml:space="preserve">0.102</w:t>
+              <w:t xml:space="preserve">0.134</w:t>
+            </w:r>
+          </w:p>
+        </w:tc>
+        <w:tc>
+          <w:p>
+            <w:pPr>
+              <w:pStyle w:val="Compact"/>
+              <w:jc w:val="left"/>
+            </w:pPr>
+            <w:r>
+              <w:t xml:space="preserve">0.141</w:t>
+            </w:r>
+          </w:p>
+        </w:tc>
+        <w:tc>
+          <w:p>
+            <w:pPr>
+              <w:pStyle w:val="Compact"/>
+              <w:jc w:val="left"/>
+            </w:pPr>
+            <w:r>
+              <w:t xml:space="preserve">0.151</w:t>
+            </w:r>
+          </w:p>
+        </w:tc>
+        <w:tc>
+          <w:p>
+            <w:pPr>
+              <w:pStyle w:val="Compact"/>
+              <w:jc w:val="left"/>
+            </w:pPr>
+            <w:r>
+              <w:t xml:space="preserve">0.171</w:t>
+            </w:r>
+          </w:p>
+        </w:tc>
+        <w:tc>
+          <w:p>
+            <w:pPr>
+              <w:pStyle w:val="Compact"/>
+              <w:jc w:val="left"/>
+            </w:pPr>
+            <w:r>
+              <w:t xml:space="preserve">0.200</w:t>
             </w:r>
           </w:p>
         </w:tc>
@@ -3708,7 +3764,7 @@
                 <w:bCs/>
                 <w:b/>
               </w:rPr>
-              <w:t xml:space="preserve">0.132</w:t>
+              <w:t xml:space="preserve">0.258</w:t>
             </w:r>
           </w:p>
         </w:tc>
@@ -3757,13 +3813,19 @@
         <w:t xml:space="preserve"> </w:t>
       </w:r>
       <w:r>
-        <w:t xml:space="preserve">Popularity đạt 0.073, cao nhất — vì khi</w:t>
-      </w:r>
-      <w:r>
-        <w:t xml:space="preserve"> </w:t>
-      </w:r>
-      <w:r>
-        <w:t xml:space="preserve">chưa biết gì về người dùng, gợi ý phổ biến là lựa chọn an toàn nhất.</w:t>
+        <w:t xml:space="preserve">Popularity đạt 0.196, ngang với Onboarding</w:t>
+      </w:r>
+      <w:r>
+        <w:t xml:space="preserve"> </w:t>
+      </w:r>
+      <w:r>
+        <w:t xml:space="preserve">(vốn lùi về popularity khi chưa có tương tác) — gợi ý phổ biến là lựa chọn an</w:t>
+      </w:r>
+      <w:r>
+        <w:t xml:space="preserve"> </w:t>
+      </w:r>
+      <w:r>
+        <w:t xml:space="preserve">toàn nhất khi chưa biết gì về người dùng.</w:t>
       </w:r>
     </w:p>
     <w:p>
@@ -3825,19 +3887,48 @@
           <w:bCs/>
           <w:b/>
         </w:rPr>
-        <w:t xml:space="preserve">Onboarding + Item-CF tăng dần:</w:t>
-      </w:r>
-      <w:r>
-        <w:t xml:space="preserve"> </w:t>
-      </w:r>
-      <w:r>
-        <w:t xml:space="preserve">từ 0.073 lên 0.104 khi có thêm tương tác,</w:t>
-      </w:r>
-      <w:r>
-        <w:t xml:space="preserve"> </w:t>
-      </w:r>
-      <w:r>
-        <w:t xml:space="preserve">cho thấy giá trị của active learning.</w:t>
+        <w:t xml:space="preserve">Các phương pháp dựa CF vượt lên khi ấm:</w:t>
+      </w:r>
+      <w:r>
+        <w:t xml:space="preserve"> </w:t>
+      </w:r>
+      <w:r>
+        <w:t xml:space="preserve">Onboarding + Item-CF đạt cao nhất</w:t>
+      </w:r>
+      <w:r>
+        <w:t xml:space="preserve"> </w:t>
+      </w:r>
+      <w:r>
+        <w:t xml:space="preserve">(</w:t>
+      </w:r>
+      <w:r>
+        <w:rPr>
+          <w:bCs/>
+          <w:b/>
+        </w:rPr>
+        <w:t xml:space="preserve">0.267</w:t>
+      </w:r>
+      <w:r>
+        <w:t xml:space="preserve"> </w:t>
+      </w:r>
+      <w:r>
+        <w:t xml:space="preserve">tại 20 tương tác), DropoutNet bám sát (</w:t>
+      </w:r>
+      <w:r>
+        <w:rPr>
+          <w:bCs/>
+          <w:b/>
+        </w:rPr>
+        <w:t xml:space="preserve">0.258</w:t>
+      </w:r>
+      <w:r>
+        <w:t xml:space="preserve">) — đều vượt</w:t>
+      </w:r>
+      <w:r>
+        <w:t xml:space="preserve"> </w:t>
+      </w:r>
+      <w:r>
+        <w:t xml:space="preserve">Popularity ~32–36% nhờ khai thác tín hiệu cộng tác.</w:t>
       </w:r>
     </w:p>
     <w:p>
@@ -3853,41 +3944,19 @@
           <w:bCs/>
           <w:b/>
         </w:rPr>
-        <w:t xml:space="preserve">DropoutNet vượt trội khi ấm:</w:t>
-      </w:r>
-      <w:r>
-        <w:t xml:space="preserve"> </w:t>
-      </w:r>
-      <w:r>
-        <w:t xml:space="preserve">khởi đầu thấp (0.034) nhưng đạt</w:t>
-      </w:r>
-      <w:r>
-        <w:t xml:space="preserve"> </w:t>
-      </w:r>
-      <w:r>
-        <w:rPr>
-          <w:bCs/>
-          <w:b/>
-        </w:rPr>
-        <w:t xml:space="preserve">0.132</w:t>
-      </w:r>
-      <w:r>
-        <w:t xml:space="preserve"> </w:t>
-      </w:r>
-      <w:r>
-        <w:t xml:space="preserve">tại</w:t>
-      </w:r>
-      <w:r>
-        <w:t xml:space="preserve"> </w:t>
-      </w:r>
-      <w:r>
-        <w:t xml:space="preserve">20 tương tác — cao hơn Popularity ~81% — nhờ chuyển dần trọng số sang</w:t>
-      </w:r>
-      <w:r>
-        <w:t xml:space="preserve"> </w:t>
-      </w:r>
-      <w:r>
-        <w:t xml:space="preserve">collaborative.</w:t>
+        <w:t xml:space="preserve">Content-based yếu và giảm nhẹ:</w:t>
+      </w:r>
+      <w:r>
+        <w:t xml:space="preserve"> </w:t>
+      </w:r>
+      <w:r>
+        <w:t xml:space="preserve">chỉ dùng thể loại (đặc trưng thô) nên không</w:t>
+      </w:r>
+      <w:r>
+        <w:t xml:space="preserve"> </w:t>
+      </w:r>
+      <w:r>
+        <w:t xml:space="preserve">tận dụng được tương tác tăng thêm.</w:t>
       </w:r>
     </w:p>
     <w:bookmarkEnd w:id="29"/>

</xml_diff>

<commit_message>
Báo cáo: thêm thông tin tác giả Hà Bảo Anh (MSHV: 25004321)
</commit_message>
<xml_diff>
--- a/docs/report/report.docx
+++ b/docs/report/report.docx
@@ -137,19 +137,19 @@
         <w:pStyle w:val="Author"/>
       </w:pPr>
       <w:r>
-        <w:t xml:space="preserve">Nhóm</w:t>
-      </w:r>
-      <w:r>
-        <w:t xml:space="preserve"> </w:t>
-      </w:r>
-      <w:r>
-        <w:t xml:space="preserve">thực</w:t>
-      </w:r>
-      <w:r>
-        <w:t xml:space="preserve"> </w:t>
-      </w:r>
-      <w:r>
-        <w:t xml:space="preserve">hiện</w:t>
+        <w:t xml:space="preserve">Hà</w:t>
+      </w:r>
+      <w:r>
+        <w:t xml:space="preserve"> </w:t>
+      </w:r>
+      <w:r>
+        <w:t xml:space="preserve">Bảo</w:t>
+      </w:r>
+      <w:r>
+        <w:t xml:space="preserve"> </w:t>
+      </w:r>
+      <w:r>
+        <w:t xml:space="preserve">Anh</w:t>
       </w:r>
       <w:r>
         <w:t xml:space="preserve"> </w:t>
@@ -161,19 +161,13 @@
         <w:t xml:space="preserve"> </w:t>
       </w:r>
       <w:r>
-        <w:t xml:space="preserve">Đồ</w:t>
-      </w:r>
-      <w:r>
-        <w:t xml:space="preserve"> </w:t>
-      </w:r>
-      <w:r>
-        <w:t xml:space="preserve">án</w:t>
-      </w:r>
-      <w:r>
-        <w:t xml:space="preserve"> </w:t>
-      </w:r>
-      <w:r>
-        <w:t xml:space="preserve">ColdFlix</w:t>
+        <w:t xml:space="preserve">MSHV:</w:t>
+      </w:r>
+      <w:r>
+        <w:t xml:space="preserve"> </w:t>
+      </w:r>
+      <w:r>
+        <w:t xml:space="preserve">25004321</w:t>
       </w:r>
     </w:p>
     <w:p>

</xml_diff>

<commit_message>
Báo cáo: heading màu xanh, font Times New Roman, ngắt trang mỗi mục lớn (reference-doc)
</commit_message>
<xml_diff>
--- a/docs/report/report.docx
+++ b/docs/report/report.docx
@@ -4844,7 +4844,7 @@
   <w:docDefaults>
     <w:rPrDefault>
       <w:rPr>
-        <w:rFonts w:asciiTheme="minorHAnsi" w:cstheme="minorBidi" w:eastAsiaTheme="minorHAnsi" w:hAnsiTheme="minorHAnsi"/>
+        <w:rFonts w:ascii="Times New Roman" w:cs="Times New Roman" w:eastAsia="Times New Roman" w:hAnsi="Times New Roman"/>
         <w:sz w:val="24"/>
         <w:szCs w:val="24"/>
         <w:lang w:bidi="ar-SA" w:eastAsia="en-US" w:val="vi"/>
@@ -4896,10 +4896,10 @@
       <w:jc w:val="center"/>
     </w:pPr>
     <w:rPr>
-      <w:rFonts w:asciiTheme="majorHAnsi" w:cstheme="majorBidi" w:eastAsiaTheme="majorEastAsia" w:hAnsiTheme="majorHAnsi"/>
+      <w:rFonts w:ascii="Times New Roman" w:cs="Times New Roman" w:eastAsia="Times New Roman" w:hAnsi="Times New Roman"/>
       <w:b/>
       <w:bCs/>
-      <w:color w:themeColor="accent1" w:themeShade="B5" w:val="345A8A"/>
+      <w:color w:val="1F4E79"/>
       <w:sz w:val="36"/>
       <w:szCs w:val="36"/>
     </w:rPr>
@@ -4970,16 +4970,17 @@
     <w:uiPriority w:val="9"/>
     <w:qFormat/>
     <w:pPr>
+      <w:pageBreakBefore/>
       <w:keepNext/>
       <w:keepLines/>
       <w:spacing w:after="0" w:before="480"/>
       <w:outlineLvl w:val="0"/>
     </w:pPr>
     <w:rPr>
-      <w:rFonts w:asciiTheme="majorHAnsi" w:cstheme="majorBidi" w:eastAsiaTheme="majorEastAsia" w:hAnsiTheme="majorHAnsi"/>
+      <w:rFonts w:ascii="Times New Roman" w:cs="Times New Roman" w:eastAsia="Times New Roman" w:hAnsi="Times New Roman"/>
       <w:b/>
       <w:bCs/>
-      <w:color w:themeColor="accent1" w:val="4F81BD"/>
+      <w:color w:val="1F4E79"/>
       <w:sz w:val="32"/>
       <w:szCs w:val="32"/>
     </w:rPr>
@@ -4998,10 +4999,10 @@
       <w:outlineLvl w:val="1"/>
     </w:pPr>
     <w:rPr>
-      <w:rFonts w:asciiTheme="majorHAnsi" w:cstheme="majorBidi" w:eastAsiaTheme="majorEastAsia" w:hAnsiTheme="majorHAnsi"/>
+      <w:rFonts w:ascii="Times New Roman" w:cs="Times New Roman" w:eastAsia="Times New Roman" w:hAnsi="Times New Roman"/>
       <w:b/>
       <w:bCs/>
-      <w:color w:themeColor="accent1" w:val="4F81BD"/>
+      <w:color w:val="1F4E79"/>
       <w:sz w:val="28"/>
       <w:szCs w:val="28"/>
     </w:rPr>
@@ -5020,10 +5021,10 @@
       <w:outlineLvl w:val="2"/>
     </w:pPr>
     <w:rPr>
-      <w:rFonts w:asciiTheme="majorHAnsi" w:cstheme="majorBidi" w:eastAsiaTheme="majorEastAsia" w:hAnsiTheme="majorHAnsi"/>
+      <w:rFonts w:ascii="Times New Roman" w:cs="Times New Roman" w:eastAsia="Times New Roman" w:hAnsi="Times New Roman"/>
       <w:b/>
       <w:bCs/>
-      <w:color w:themeColor="accent1" w:val="4F81BD"/>
+      <w:color w:val="1F4E79"/>
       <w:sz w:val="24"/>
       <w:szCs w:val="24"/>
     </w:rPr>
@@ -5042,10 +5043,10 @@
       <w:outlineLvl w:val="3"/>
     </w:pPr>
     <w:rPr>
-      <w:rFonts w:asciiTheme="majorHAnsi" w:cstheme="majorBidi" w:eastAsiaTheme="majorEastAsia" w:hAnsiTheme="majorHAnsi"/>
+      <w:rFonts w:ascii="Times New Roman" w:cs="Times New Roman" w:eastAsia="Times New Roman" w:hAnsi="Times New Roman"/>
       <w:i/>
       <w:bCs/>
-      <w:color w:themeColor="accent1" w:val="4F81BD"/>
+      <w:color w:val="1F4E79"/>
       <w:sz w:val="24"/>
       <w:szCs w:val="24"/>
     </w:rPr>
@@ -5064,9 +5065,9 @@
       <w:outlineLvl w:val="4"/>
     </w:pPr>
     <w:rPr>
-      <w:rFonts w:asciiTheme="majorHAnsi" w:cstheme="majorBidi" w:eastAsiaTheme="majorEastAsia" w:hAnsiTheme="majorHAnsi"/>
+      <w:rFonts w:ascii="Times New Roman" w:cs="Times New Roman" w:eastAsia="Times New Roman" w:hAnsi="Times New Roman"/>
       <w:iCs/>
-      <w:color w:themeColor="accent1" w:val="4F81BD"/>
+      <w:color w:val="1F4E79"/>
       <w:sz w:val="24"/>
       <w:szCs w:val="24"/>
     </w:rPr>
@@ -5085,8 +5086,8 @@
       <w:outlineLvl w:val="5"/>
     </w:pPr>
     <w:rPr>
-      <w:rFonts w:asciiTheme="majorHAnsi" w:cstheme="majorBidi" w:eastAsiaTheme="majorEastAsia" w:hAnsiTheme="majorHAnsi"/>
-      <w:color w:themeColor="accent1" w:val="4F81BD"/>
+      <w:rFonts w:ascii="Times New Roman" w:cs="Times New Roman" w:eastAsia="Times New Roman" w:hAnsi="Times New Roman"/>
+      <w:color w:val="1F4E79"/>
       <w:sz w:val="24"/>
       <w:szCs w:val="24"/>
     </w:rPr>
@@ -5105,8 +5106,8 @@
       <w:outlineLvl w:val="6"/>
     </w:pPr>
     <w:rPr>
-      <w:rFonts w:asciiTheme="majorHAnsi" w:cstheme="majorBidi" w:eastAsiaTheme="majorEastAsia" w:hAnsiTheme="majorHAnsi"/>
-      <w:color w:themeColor="accent1" w:val="4F81BD"/>
+      <w:rFonts w:ascii="Times New Roman" w:cs="Times New Roman" w:eastAsia="Times New Roman" w:hAnsi="Times New Roman"/>
+      <w:color w:val="1F4E79"/>
       <w:sz w:val="24"/>
       <w:szCs w:val="24"/>
     </w:rPr>
@@ -5125,8 +5126,8 @@
       <w:outlineLvl w:val="7"/>
     </w:pPr>
     <w:rPr>
-      <w:rFonts w:asciiTheme="majorHAnsi" w:cstheme="majorBidi" w:eastAsiaTheme="majorEastAsia" w:hAnsiTheme="majorHAnsi"/>
-      <w:color w:themeColor="accent1" w:val="4F81BD"/>
+      <w:rFonts w:ascii="Times New Roman" w:cs="Times New Roman" w:eastAsia="Times New Roman" w:hAnsi="Times New Roman"/>
+      <w:color w:val="1F4E79"/>
       <w:sz w:val="24"/>
       <w:szCs w:val="24"/>
     </w:rPr>
@@ -5145,8 +5146,8 @@
       <w:outlineLvl w:val="8"/>
     </w:pPr>
     <w:rPr>
-      <w:rFonts w:asciiTheme="majorHAnsi" w:cstheme="majorBidi" w:eastAsiaTheme="majorEastAsia" w:hAnsiTheme="majorHAnsi"/>
-      <w:color w:themeColor="accent1" w:val="4F81BD"/>
+      <w:rFonts w:ascii="Times New Roman" w:cs="Times New Roman" w:eastAsia="Times New Roman" w:hAnsi="Times New Roman"/>
+      <w:color w:val="1F4E79"/>
       <w:sz w:val="24"/>
       <w:szCs w:val="24"/>
     </w:rPr>
@@ -5285,7 +5286,7 @@
     <w:name w:val="Hyperlink"/>
     <w:basedOn w:val="BodyTextChar"/>
     <w:rPr>
-      <w:color w:themeColor="accent1" w:val="4F81BD"/>
+      <w:color w:val="1F4E79"/>
     </w:rPr>
   </w:style>
   <w:style w:styleId="TOCHeading" w:type="paragraph">
@@ -5300,10 +5301,10 @@
       <w:outlineLvl w:val="9"/>
     </w:pPr>
     <w:rPr>
-      <w:rFonts w:asciiTheme="majorHAnsi" w:cstheme="majorBidi" w:eastAsiaTheme="majorEastAsia" w:hAnsiTheme="majorHAnsi"/>
+      <w:rFonts w:ascii="Times New Roman" w:cs="Times New Roman" w:eastAsia="Times New Roman" w:hAnsi="Times New Roman"/>
       <w:b w:val="0"/>
       <w:bCs w:val="0"/>
-      <w:color w:themeColor="accent1" w:themeShade="BF" w:val="365F91"/>
+      <w:color w:val="1F4E79"/>
     </w:rPr>
   </w:style>
   <w:style w:type="paragraph" w:customStyle="1" w:styleId="SourceCode">
@@ -5581,7 +5582,7 @@
     </a:clrScheme>
     <a:fontScheme name="Office">
       <a:majorFont>
-        <a:latin typeface="Calibri"/>
+        <a:latin typeface="Times New Roman"/>
         <a:ea typeface=""/>
         <a:cs typeface=""/>
         <a:font script="Jpan" typeface="ＭＳ ゴシック"/>
@@ -5615,7 +5616,7 @@
         <a:font script="Uigh" typeface="Microsoft Uighur"/>
       </a:majorFont>
       <a:minorFont>
-        <a:latin typeface="Cambria"/>
+        <a:latin typeface="Times New Roman"/>
         <a:ea typeface=""/>
         <a:cs typeface=""/>
         <a:font script="Jpan" typeface="ＭＳ 明朝"/>

</xml_diff>